<commit_message>
Sycophancy-epistemic risk extension: 8 verified sources (Nature, Nature Human Behaviour, CHI, ICLR, ACL, IJAIS, NIST) woven into Ch6.3 + Figure 2 dissertation model (v2 diagram: core + AI layer); md2pdf image rendering fixed — model diagram now visible in PDF; both figures embedded in Word
Co-Authored-By: Claude Fable 5 <noreply@anthropic.com>
Claude-Session: https://claude.ai/code/session_019uQWfMoV11me5yJ6LYRtPv
</commit_message>
<xml_diff>
--- a/dba/00_Execution/AI_Audit_Risk_Research_Brief.docx
+++ b/dba/00_Execution/AI_Audit_Risk_Research_Brief.docx
@@ -293,6 +293,136 @@
       </w:r>
       <w:r>
         <w:t xml:space="preserve"> — AI &amp; bias in banking/financial services review + research agenda.</w:t>
+      </w:r>
+    </w:p>
+    <w:p>
+      <w:pPr>
+        <w:pStyle w:val="Heading2"/>
+      </w:pPr>
+      <w:r>
+        <w:t>Addendum (Jul 24, 2026): Sycophancy → Epistemic Risk chain — verified sources</w:t>
+      </w:r>
+    </w:p>
+    <w:p>
+      <w:r>
+        <w:rPr>
+          <w:b/>
+        </w:rPr>
+        <w:t>The dissertation's new causal layer:</w:t>
+      </w:r>
+      <w:r>
+        <w:t xml:space="preserve"> prior-period anchor → LLM sycophancy confirms it → epistemic risk (conclusions drift toward confirmation). Figure: </w:t>
+      </w:r>
+      <w:r>
+        <w:rPr>
+          <w:rFonts w:ascii="Courier New" w:hAnsi="Courier New"/>
+        </w:rPr>
+        <w:t>Anchoring_Bias_Model_v2_Dissertation.png</w:t>
+      </w:r>
+      <w:r>
+        <w:t>.</w:t>
+      </w:r>
+    </w:p>
+    <w:p>
+      <w:pPr>
+        <w:pStyle w:val="ListBullet"/>
+      </w:pPr>
+      <w:r>
+        <w:t>Sharma et al. (2024), ICLR — foundational sycophancy evidence; RLHF rewards agreement over truth. arXiv:2310.13548</w:t>
+      </w:r>
+    </w:p>
+    <w:p>
+      <w:pPr>
+        <w:pStyle w:val="ListBullet"/>
+      </w:pPr>
+      <w:r>
+        <w:t>Perez et al. (2023), ACL Findings — sycophancy scales with model size/RLHF. arXiv:2212.09251</w:t>
+      </w:r>
+    </w:p>
+    <w:p>
+      <w:pPr>
+        <w:pStyle w:val="ListBullet"/>
+      </w:pPr>
+      <w:r>
+        <w:t>Fanous et al. (2025) — SycEval: sycophancy in 58% of tested cases; regressive (right→wrong) shifts under rebuttal. arXiv:2502.08177</w:t>
+      </w:r>
+    </w:p>
+    <w:p>
+      <w:pPr>
+        <w:pStyle w:val="ListBullet"/>
+      </w:pPr>
+      <w:r>
+        <w:t xml:space="preserve">Glickman &amp; Sharot (2025), </w:t>
+      </w:r>
+      <w:r>
+        <w:rPr>
+          <w:i/>
+        </w:rPr>
+        <w:t>Nature Human Behaviour</w:t>
+      </w:r>
+      <w:r>
+        <w:t xml:space="preserve"> — human bias absorbed, amplified, fed back; users unaware. DOI: 10.1038/s41562-024-02077-2</w:t>
+      </w:r>
+    </w:p>
+    <w:p>
+      <w:pPr>
+        <w:pStyle w:val="ListBullet"/>
+      </w:pPr>
+      <w:r>
+        <w:t>Lee et al. (2025), CHI — GenAI confidence ↓ critical thinking in 936 real knowledge-work tasks. DOI: 10.1145/3706598.3713778</w:t>
+      </w:r>
+    </w:p>
+    <w:p>
+      <w:pPr>
+        <w:pStyle w:val="ListBullet"/>
+      </w:pPr>
+      <w:r>
+        <w:t xml:space="preserve">Messeri &amp; Crockett (2024), </w:t>
+      </w:r>
+      <w:r>
+        <w:rPr>
+          <w:i/>
+        </w:rPr>
+        <w:t>Nature</w:t>
+      </w:r>
+      <w:r>
+        <w:t xml:space="preserve"> — illusions of understanding, epistemic monoculture. DOI: 10.1038/s41586-024-07146-0</w:t>
+      </w:r>
+    </w:p>
+    <w:p>
+      <w:pPr>
+        <w:pStyle w:val="ListBullet"/>
+      </w:pPr>
+      <w:r>
+        <w:t>Fotoh &amp; Mugwira (2025), IJAIS — LLM over-reliance threatens professional skepticism in external audit. DOI: 10.1016/j.accinf.2025.100748</w:t>
+      </w:r>
+    </w:p>
+    <w:p>
+      <w:pPr>
+        <w:pStyle w:val="ListBullet"/>
+      </w:pPr>
+      <w:r>
+        <w:t>NIST AI 600-1 (2024) — "Human-AI Configuration" risk class: over-reliance, miscalibrated oversight.</w:t>
+      </w:r>
+    </w:p>
+    <w:p>
+      <w:r>
+        <w:rPr>
+          <w:b/>
+        </w:rPr>
+        <w:t>Contribution claim:</w:t>
+      </w:r>
+      <w:r>
+        <w:t xml:space="preserve"> sycophancy has validated behavioral metrics (SycophancyEval, SycEval); </w:t>
+      </w:r>
+      <w:r>
+        <w:rPr>
+          <w:b/>
+        </w:rPr>
+        <w:t>epistemic risk has no standardized instrument</w:t>
+      </w:r>
+      <w:r>
+        <w:t xml:space="preserve"> — operationalizing epistemic drift vs. independent-evidence benchmarks is the dissertation's measurement contribution.</w:t>
       </w:r>
     </w:p>
     <w:sectPr>

</xml_diff>